<commit_message>
PCI: inject {{HAZ_*}} placeholders into DOCX template + revert preview
- Road_Space_Request_Form_TEMPLATE.docx: added {{HAZ_WORKING_HEIGHT}},
  {{HAZ_SLIPS}}, {{HAZ_EXCAVATIONS}}, {{HAZ_STRUCTURES}}, {{HAZ_HEALTH}},
  {{HAZ_ASBESTOS}}, {{HAZ_PUBLIC}}, {{HAZ_ENVIRONMENT}}, {{HAZ_OTHER}},
  {{HAZ_ADDITIONAL}} as new paragraphs at the end of the left cell in
  each hazard row (Table 1, rows 1–10). No existing text, formatting,
  borders or styles changed — placeholders appear below the existing
  heading and instructional bullet text in the same Arial 10pt style.
- PCIPreview.jsx: reverted modal preview back to PCIDoc (docx-preview)
  so the injected values are visible in the live preview

https://claude.ai/code/session_01Nc3L33RdvZTDhVy6BGkTVT
</commit_message>
<xml_diff>
--- a/templates/Road_Space_Request_Form_TEMPLATE.docx
+++ b/templates/Road_Space_Request_Form_TEMPLATE.docx
@@ -1,6 +1,6 @@
 
 <file path=word/document.xml><?xml version="1.0" encoding="utf-8"?>
-<w:document xmlns:o="urn:schemas-microsoft-com:office:office" xmlns:r="http://schemas.openxmlformats.org/officeDocument/2006/relationships" xmlns:v="urn:schemas-microsoft-com:vml" xmlns:w="http://schemas.openxmlformats.org/wordprocessingml/2006/main" xmlns:w10="urn:schemas-microsoft-com:office:word" xmlns:wp="http://schemas.openxmlformats.org/drawingml/2006/wordprocessingDrawing" xmlns:wps="http://schemas.microsoft.com/office/word/2010/wordprocessingShape" xmlns:wpg="http://schemas.microsoft.com/office/word/2010/wordprocessingGroup" xmlns:mc="http://schemas.openxmlformats.org/markup-compatibility/2006" xmlns:wp14="http://schemas.microsoft.com/office/word/2010/wordprocessingDrawing" xmlns:w14="http://schemas.microsoft.com/office/word/2010/wordml" xmlns:w15="http://schemas.microsoft.com/office/word/2012/wordml" mc:Ignorable="w14 wp14 w15">
+<w:document xmlns:mc="http://schemas.openxmlformats.org/markup-compatibility/2006" xmlns:ns3="http://schemas.openxmlformats.org/drawingml/2006/main" xmlns:ns4="http://schemas.openxmlformats.org/drawingml/2006/picture" xmlns:r="http://schemas.openxmlformats.org/officeDocument/2006/relationships" xmlns:w="http://schemas.openxmlformats.org/wordprocessingml/2006/main" xmlns:wp="http://schemas.openxmlformats.org/drawingml/2006/wordprocessingDrawing" mc:Ignorable="w14 wp14 w15">
   <w:body>
     <w:tbl>
       <w:tblPr>
@@ -57,35 +57,35 @@
                   <wp:effectExtent l="0" t="0" r="0" b="0"/>
                   <wp:docPr id="1" name="Picture 1" descr=""/>
                   <wp:cNvGraphicFramePr>
-                    <a:graphicFrameLocks xmlns:a="http://schemas.openxmlformats.org/drawingml/2006/main" noChangeAspect="1"/>
+                    <ns3:graphicFrameLocks noChangeAspect="1"/>
                   </wp:cNvGraphicFramePr>
-                  <a:graphic xmlns:a="http://schemas.openxmlformats.org/drawingml/2006/main">
-                    <a:graphicData uri="http://schemas.openxmlformats.org/drawingml/2006/picture">
-                      <pic:pic xmlns:pic="http://schemas.openxmlformats.org/drawingml/2006/picture">
-                        <pic:nvPicPr>
-                          <pic:cNvPr id="1" name="Picture 1" descr=""/>
-                          <pic:cNvPicPr>
-                            <a:picLocks noChangeAspect="1" noChangeArrowheads="1"/>
-                          </pic:cNvPicPr>
-                        </pic:nvPicPr>
-                        <pic:blipFill>
-                          <a:blip r:embed="rId2"/>
-                          <a:stretch>
-                            <a:fillRect/>
-                          </a:stretch>
-                        </pic:blipFill>
-                        <pic:spPr bwMode="auto">
-                          <a:xfrm>
-                            <a:off x="0" y="0"/>
-                            <a:ext cx="1190625" cy="638175"/>
-                          </a:xfrm>
-                          <a:prstGeom prst="rect">
-                            <a:avLst/>
-                          </a:prstGeom>
-                        </pic:spPr>
-                      </pic:pic>
-                    </a:graphicData>
-                  </a:graphic>
+                  <ns3:graphic>
+                    <ns3:graphicData uri="http://schemas.openxmlformats.org/drawingml/2006/picture">
+                      <ns4:pic>
+                        <ns4:nvPicPr>
+                          <ns4:cNvPr id="1" name="Picture 1" descr=""/>
+                          <ns4:cNvPicPr>
+                            <ns3:picLocks noChangeAspect="1" noChangeArrowheads="1"/>
+                          </ns4:cNvPicPr>
+                        </ns4:nvPicPr>
+                        <ns4:blipFill>
+                          <ns3:blip r:embed="rId2"/>
+                          <ns3:stretch>
+                            <ns3:fillRect/>
+                          </ns3:stretch>
+                        </ns4:blipFill>
+                        <ns4:spPr bwMode="auto">
+                          <ns3:xfrm>
+                            <ns3:off x="0" y="0"/>
+                            <ns3:ext cx="1190625" cy="638175"/>
+                          </ns3:xfrm>
+                          <ns3:prstGeom prst="rect">
+                            <ns3:avLst/>
+                          </ns3:prstGeom>
+                        </ns4:spPr>
+                      </ns4:pic>
+                    </ns3:graphicData>
+                  </ns3:graphic>
                 </wp:inline>
               </w:drawing>
             </w:r>
@@ -2477,6 +2477,29 @@
               </w:rPr>
             </w:r>
           </w:p>
+          <w:p>
+            <w:pPr>
+              <w:pStyle w:val="Normal"/>
+              <w:widowControl/>
+              <w:spacing w:before="0" w:after="0"/>
+              <w:jc w:val="left"/>
+              <w:rPr>
+                <w:rFonts w:ascii="Arial" w:hAnsi="Arial" w:cs="Arial"/>
+                <w:sz w:val="20"/>
+                <w:szCs w:val="20"/>
+              </w:rPr>
+            </w:pPr>
+            <w:r>
+              <w:rPr>
+                <w:rFonts w:eastAsia="Times New Roman" w:cs="Arial" w:ascii="Arial" w:hAnsi="Arial"/>
+                <w:kern w:val="0"/>
+                <w:sz w:val="20"/>
+                <w:szCs w:val="20"/>
+                <w:lang w:val="en-GB" w:eastAsia="en-GB" w:bidi="ar-SA"/>
+              </w:rPr>
+              <w:t xml:space="preserve">{{HAZ_WORKING_HEIGHT}}</w:t>
+            </w:r>
+          </w:p>
         </w:tc>
         <w:tc>
           <w:tcPr>
@@ -2617,6 +2640,29 @@
               </w:rPr>
             </w:r>
           </w:p>
+          <w:p>
+            <w:pPr>
+              <w:pStyle w:val="Normal"/>
+              <w:widowControl/>
+              <w:spacing w:before="0" w:after="0"/>
+              <w:jc w:val="left"/>
+              <w:rPr>
+                <w:rFonts w:ascii="Arial" w:hAnsi="Arial" w:cs="Arial"/>
+                <w:sz w:val="20"/>
+                <w:szCs w:val="20"/>
+              </w:rPr>
+            </w:pPr>
+            <w:r>
+              <w:rPr>
+                <w:rFonts w:eastAsia="Times New Roman" w:cs="Arial" w:ascii="Arial" w:hAnsi="Arial"/>
+                <w:kern w:val="0"/>
+                <w:sz w:val="20"/>
+                <w:szCs w:val="20"/>
+                <w:lang w:val="en-GB" w:eastAsia="en-GB" w:bidi="ar-SA"/>
+              </w:rPr>
+              <w:t xml:space="preserve">{{HAZ_SLIPS}}</w:t>
+            </w:r>
+          </w:p>
         </w:tc>
         <w:tc>
           <w:tcPr>
@@ -2755,6 +2801,29 @@
               </w:rPr>
             </w:r>
           </w:p>
+          <w:p>
+            <w:pPr>
+              <w:pStyle w:val="Normal"/>
+              <w:widowControl/>
+              <w:spacing w:before="0" w:after="0"/>
+              <w:jc w:val="left"/>
+              <w:rPr>
+                <w:rFonts w:ascii="Arial" w:hAnsi="Arial" w:cs="Arial"/>
+                <w:sz w:val="20"/>
+                <w:szCs w:val="20"/>
+              </w:rPr>
+            </w:pPr>
+            <w:r>
+              <w:rPr>
+                <w:rFonts w:eastAsia="Times New Roman" w:cs="Arial" w:ascii="Arial" w:hAnsi="Arial"/>
+                <w:kern w:val="0"/>
+                <w:sz w:val="20"/>
+                <w:szCs w:val="20"/>
+                <w:lang w:val="en-GB" w:eastAsia="en-GB" w:bidi="ar-SA"/>
+              </w:rPr>
+              <w:t xml:space="preserve">{{HAZ_EXCAVATIONS}}</w:t>
+            </w:r>
+          </w:p>
         </w:tc>
         <w:tc>
           <w:tcPr>
@@ -2895,6 +2964,29 @@
               </w:rPr>
             </w:r>
           </w:p>
+          <w:p>
+            <w:pPr>
+              <w:pStyle w:val="Normal"/>
+              <w:widowControl/>
+              <w:spacing w:before="0" w:after="0"/>
+              <w:jc w:val="left"/>
+              <w:rPr>
+                <w:rFonts w:ascii="Arial" w:hAnsi="Arial" w:cs="Arial"/>
+                <w:sz w:val="20"/>
+                <w:szCs w:val="20"/>
+              </w:rPr>
+            </w:pPr>
+            <w:r>
+              <w:rPr>
+                <w:rFonts w:eastAsia="Times New Roman" w:cs="Arial" w:ascii="Arial" w:hAnsi="Arial"/>
+                <w:kern w:val="0"/>
+                <w:sz w:val="20"/>
+                <w:szCs w:val="20"/>
+                <w:lang w:val="en-GB" w:eastAsia="en-GB" w:bidi="ar-SA"/>
+              </w:rPr>
+              <w:t xml:space="preserve">{{HAZ_STRUCTURES}}</w:t>
+            </w:r>
+          </w:p>
         </w:tc>
         <w:tc>
           <w:tcPr>
@@ -3061,6 +3153,29 @@
               </w:rPr>
             </w:r>
           </w:p>
+          <w:p>
+            <w:pPr>
+              <w:pStyle w:val="Normal"/>
+              <w:widowControl/>
+              <w:spacing w:before="0" w:after="0"/>
+              <w:jc w:val="left"/>
+              <w:rPr>
+                <w:rFonts w:ascii="Arial" w:hAnsi="Arial" w:cs="Arial"/>
+                <w:sz w:val="20"/>
+                <w:szCs w:val="20"/>
+              </w:rPr>
+            </w:pPr>
+            <w:r>
+              <w:rPr>
+                <w:rFonts w:eastAsia="Times New Roman" w:cs="Arial" w:ascii="Arial" w:hAnsi="Arial"/>
+                <w:kern w:val="0"/>
+                <w:sz w:val="20"/>
+                <w:szCs w:val="20"/>
+                <w:lang w:val="en-GB" w:eastAsia="en-GB" w:bidi="ar-SA"/>
+              </w:rPr>
+              <w:t xml:space="preserve">{{HAZ_HEALTH}}</w:t>
+            </w:r>
+          </w:p>
         </w:tc>
         <w:tc>
           <w:tcPr>
@@ -3203,6 +3318,29 @@
               </w:rPr>
             </w:r>
           </w:p>
+          <w:p>
+            <w:pPr>
+              <w:pStyle w:val="Normal"/>
+              <w:widowControl/>
+              <w:spacing w:before="0" w:after="0"/>
+              <w:jc w:val="left"/>
+              <w:rPr>
+                <w:rFonts w:ascii="Arial" w:hAnsi="Arial" w:cs="Arial"/>
+                <w:sz w:val="20"/>
+                <w:szCs w:val="20"/>
+              </w:rPr>
+            </w:pPr>
+            <w:r>
+              <w:rPr>
+                <w:rFonts w:eastAsia="Times New Roman" w:cs="Arial" w:ascii="Arial" w:hAnsi="Arial"/>
+                <w:kern w:val="0"/>
+                <w:sz w:val="20"/>
+                <w:szCs w:val="20"/>
+                <w:lang w:val="en-GB" w:eastAsia="en-GB" w:bidi="ar-SA"/>
+              </w:rPr>
+              <w:t xml:space="preserve">{{HAZ_ASBESTOS}}</w:t>
+            </w:r>
+          </w:p>
         </w:tc>
         <w:tc>
           <w:tcPr>
@@ -3341,6 +3479,29 @@
               </w:rPr>
             </w:r>
           </w:p>
+          <w:p>
+            <w:pPr>
+              <w:pStyle w:val="Normal"/>
+              <w:widowControl/>
+              <w:spacing w:before="0" w:after="0"/>
+              <w:jc w:val="left"/>
+              <w:rPr>
+                <w:rFonts w:ascii="Arial" w:hAnsi="Arial" w:cs="Arial"/>
+                <w:sz w:val="20"/>
+                <w:szCs w:val="20"/>
+              </w:rPr>
+            </w:pPr>
+            <w:r>
+              <w:rPr>
+                <w:rFonts w:eastAsia="Times New Roman" w:cs="Arial" w:ascii="Arial" w:hAnsi="Arial"/>
+                <w:kern w:val="0"/>
+                <w:sz w:val="20"/>
+                <w:szCs w:val="20"/>
+                <w:lang w:val="en-GB" w:eastAsia="en-GB" w:bidi="ar-SA"/>
+              </w:rPr>
+              <w:t xml:space="preserve">{{HAZ_PUBLIC}}</w:t>
+            </w:r>
+          </w:p>
         </w:tc>
         <w:tc>
           <w:tcPr>
@@ -3479,6 +3640,29 @@
               </w:rPr>
             </w:r>
           </w:p>
+          <w:p>
+            <w:pPr>
+              <w:pStyle w:val="Normal"/>
+              <w:widowControl/>
+              <w:spacing w:before="0" w:after="0"/>
+              <w:jc w:val="left"/>
+              <w:rPr>
+                <w:rFonts w:ascii="Arial" w:hAnsi="Arial" w:cs="Arial"/>
+                <w:sz w:val="20"/>
+                <w:szCs w:val="20"/>
+              </w:rPr>
+            </w:pPr>
+            <w:r>
+              <w:rPr>
+                <w:rFonts w:eastAsia="Times New Roman" w:cs="Arial" w:ascii="Arial" w:hAnsi="Arial"/>
+                <w:kern w:val="0"/>
+                <w:sz w:val="20"/>
+                <w:szCs w:val="20"/>
+                <w:lang w:val="en-GB" w:eastAsia="en-GB" w:bidi="ar-SA"/>
+              </w:rPr>
+              <w:t xml:space="preserve">{{HAZ_ENVIRONMENT}}</w:t>
+            </w:r>
+          </w:p>
         </w:tc>
         <w:tc>
           <w:tcPr>
@@ -3765,6 +3949,29 @@
                 <w:lang w:val="en-GB" w:eastAsia="en-GB" w:bidi="ar-SA"/>
               </w:rPr>
               <w:t>Water courses, drainage issues</w:t>
+            </w:r>
+          </w:p>
+          <w:p>
+            <w:pPr>
+              <w:pStyle w:val="Normal"/>
+              <w:widowControl/>
+              <w:spacing w:before="0" w:after="0"/>
+              <w:jc w:val="left"/>
+              <w:rPr>
+                <w:rFonts w:ascii="Arial" w:hAnsi="Arial" w:cs="Arial"/>
+                <w:sz w:val="20"/>
+                <w:szCs w:val="20"/>
+              </w:rPr>
+            </w:pPr>
+            <w:r>
+              <w:rPr>
+                <w:rFonts w:eastAsia="Times New Roman" w:cs="Arial" w:ascii="Arial" w:hAnsi="Arial"/>
+                <w:kern w:val="0"/>
+                <w:sz w:val="20"/>
+                <w:szCs w:val="20"/>
+                <w:lang w:val="en-GB" w:eastAsia="en-GB" w:bidi="ar-SA"/>
+              </w:rPr>
+              <w:t xml:space="preserve">{{HAZ_OTHER}}</w:t>
             </w:r>
           </w:p>
         </w:tc>
@@ -4140,6 +4347,29 @@
                 <w:szCs w:val="16"/>
                 <w:lang w:val="en-GB" w:eastAsia="en-GB" w:bidi="ar-SA"/>
               </w:rPr>
+            </w:r>
+          </w:p>
+          <w:p>
+            <w:pPr>
+              <w:pStyle w:val="Normal"/>
+              <w:widowControl/>
+              <w:spacing w:before="0" w:after="0"/>
+              <w:jc w:val="left"/>
+              <w:rPr>
+                <w:rFonts w:ascii="Arial" w:hAnsi="Arial" w:cs="Arial"/>
+                <w:sz w:val="20"/>
+                <w:szCs w:val="20"/>
+              </w:rPr>
+            </w:pPr>
+            <w:r>
+              <w:rPr>
+                <w:rFonts w:eastAsia="Times New Roman" w:cs="Arial" w:ascii="Arial" w:hAnsi="Arial"/>
+                <w:kern w:val="0"/>
+                <w:sz w:val="20"/>
+                <w:szCs w:val="20"/>
+                <w:lang w:val="en-GB" w:eastAsia="en-GB" w:bidi="ar-SA"/>
+              </w:rPr>
+              <w:t xml:space="preserve">{{HAZ_ADDITIONAL}}</w:t>
             </w:r>
           </w:p>
         </w:tc>

</xml_diff>